<commit_message>
Update AquiferOpenStudyNotesBookIntros for 2026-08-28
</commit_message>
<xml_diff>
--- a/arb/docx/02.content.docx
+++ b/arb/docx/02.content.docx
@@ -559,15 +559,15 @@
           <w:cs/>
           <w:lang w:val="ar_AE" w:bidi="ar_AE"/>
         </w:rPr>
-        <w:t xml:space="preserve"> التكوين - سفر التثنية)، على الرغم من أن العديد من العلماء يُشككون في ذلك. اُنظر </w:t>
-      </w:r>
-      <w:r>
-        <w:rPr>
-          <w:rtl/>
-          <w:cs/>
-          <w:lang w:val="ar_AE" w:bidi="ar_AE"/>
-        </w:rPr>
-        <w:t>مُقدمة سفر التكوين</w:t>
+        <w:t xml:space="preserve"> التكوين - سفر التثنية)، على الرغم من أن العديد من العلماء يُشككون في ذلك. اُنظر</w:t>
+      </w:r>
+      <w:r>
+        <w:rPr>
+          <w:rtl/>
+          <w:cs/>
+          <w:lang w:val="ar_AE" w:bidi="ar_AE"/>
+        </w:rPr>
+        <w:t xml:space="preserve"> مُقدمة سفر التكوين</w:t>
       </w:r>
       <w:r>
         <w:rPr>

</xml_diff>